<commit_message>
ca6 reply brief: docx/render.sh, pages.lua, make-reference.sh, reference-src/ and reference.docx give way to fb render: reference.xml (base="xengine", CA Body Keep, settings.xml with compatibilityMode 15), and ca6-reply-brief.lua writes needles (each TOC heading and citation with the words after it, in document order), its page footer and the last section; .docx.pdf byte-identical, document.xml and styles.xml XML-identical; baseline entry removed; check.sh typst, latex, docx 0 failed, XENG-001..003 pass (fb-595.68.5)
</commit_message>
<xml_diff>
--- a/courts/sixth-circuit/court-of-appeals/reply-brief/usage/OUTPUT-reply-brief.docx
+++ b/courts/sixth-circuit/court-of-appeals/reply-brief/usage/OUTPUT-reply-brief.docx
@@ -2940,20 +2940,147 @@
 <w:comments xmlns:w="http://schemas.openxmlformats.org/wordprocessingml/2006/main" xmlns:m="http://schemas.openxmlformats.org/officeDocument/2006/math" xmlns:r="http://schemas.openxmlformats.org/officeDocument/2006/relationships" xmlns:o="urn:schemas-microsoft-com:office:office" xmlns:v="urn:schemas-microsoft-com:vml" xmlns:w10="urn:schemas-microsoft-com:office:word" xmlns:a="http://schemas.openxmlformats.org/drawingml/2006/main" xmlns:pic="http://schemas.openxmlformats.org/drawingml/2006/picture" xmlns:wp="http://schemas.openxmlformats.org/drawingml/2006/wordprocessingDrawing"/>
 </file>
 
-<file path=word/footer0.xml><?xml version="1.0" encoding="utf-8"?>
-<w:ftr xmlns:w="http://schemas.openxmlformats.org/wordprocessingml/2006/main">
+<file path=word/footer1.xml><?xml version="1.0" encoding="utf-8"?>
+<w:ftr xmlns:w="http://schemas.openxmlformats.org/wordprocessingml/2006/main" xmlns:r="http://schemas.openxmlformats.org/officeDocument/2006/relationships">
   <w:p>
     <w:pPr>
-      <w:spacing w:before="0" w:after="0" w:line="400" w:lineRule="exact"/>
-      <w:ind w:firstLine="0"/>
+      <w:jc w:val="center"/>
+    </w:pPr>
+    <w:r>
+      <w:fldChar w:fldCharType="begin"/>
+    </w:r>
+    <w:r>
+      <w:instrText xml:space="preserve"> PAGE </w:instrText>
+    </w:r>
+    <w:r>
+      <w:fldChar w:fldCharType="separate"/>
+    </w:r>
+    <w:r>
+      <w:t>1</w:t>
+    </w:r>
+    <w:r>
+      <w:fldChar w:fldCharType="end"/>
+    </w:r>
+  </w:p>
+</w:ftr>
+</file>
+
+<file path=word/footnotes.xml><?xml version="1.0" encoding="utf-8"?>
+<w:footnotes xmlns:w="http://schemas.openxmlformats.org/wordprocessingml/2006/main" xmlns:m="http://schemas.openxmlformats.org/officeDocument/2006/math" xmlns:r="http://schemas.openxmlformats.org/officeDocument/2006/relationships" xmlns:o="urn:schemas-microsoft-com:office:office" xmlns:v="urn:schemas-microsoft-com:vml" xmlns:w10="urn:schemas-microsoft-com:office:word" xmlns:a="http://schemas.openxmlformats.org/drawingml/2006/main" xmlns:pic="http://schemas.openxmlformats.org/drawingml/2006/picture" xmlns:wp="http://schemas.openxmlformats.org/drawingml/2006/wordprocessingDrawing">
+  <w:footnote w:type="continuationSeparator" w:id="0">
+    <w:p>
+      <w:r>
+        <w:continuationSeparator/>
+      </w:r>
+    </w:p>
+  </w:footnote>
+  <w:footnote w:type="separator" w:id="-1">
+    <w:p>
+      <w:r>
+        <w:separator/>
+      </w:r>
+    </w:p>
+  </w:footnote>
+  <w:footnote w:id="9">
+    <w:p>
+      <w:pPr>
+        <w:pStyle w:val="FootnoteText"/>
+      </w:pPr>
+      <w:r>
+        <w:rPr>
+          <w:rStyle w:val="FootnoteReference"/>
+        </w:rPr>
+        <w:footnoteRef/>
+      </w:r>
+      <w:r>
+        <w:t xml:space="preserve"> </w:t>
+      </w:r>
+      <w:r>
+        <w:t xml:space="preserve">Like the district court in its opinion, PAM in its brief attempts to “carve the work environment into a series of discrete incidents and then measure the harm occurring in each episode,” which “is improper.”</w:t>
+      </w:r>
+      <w:r>
+        <w:t xml:space="preserve"> </w:t>
+      </w:r>
+      <w:r>
+        <w:rPr>
+          <w:i/>
+          <w:iCs/>
+        </w:rPr>
+        <w:t xml:space="preserve">McNeal v. City of Blue Ash</w:t>
+      </w:r>
+      <w:r>
+        <w:t xml:space="preserve">, 117 F.4th 887, 905 (6th Cir. 2024) (quoting</w:t>
+      </w:r>
+      <w:r>
+        <w:t xml:space="preserve"> </w:t>
+      </w:r>
+      <w:r>
+        <w:rPr>
+          <w:i/>
+          <w:iCs/>
+        </w:rPr>
+        <w:t xml:space="preserve">Jackson v. Quanex Corp.</w:t>
+      </w:r>
+      <w:r>
+        <w:t xml:space="preserve">, 191 F.3d 647, 660 (6th Cir. 1999)). Instead, “the ‘totality of the circumstances’ approach requires” courts “to examine [plaintiff]’s treatment cumulatively to see whether it created an atmosphere of hostility that was more than the sum of its parts.”</w:t>
+      </w:r>
+      <w:r>
+        <w:t xml:space="preserve"> </w:t>
+      </w:r>
+      <w:r>
+        <w:rPr>
+          <w:i/>
+          <w:iCs/>
+        </w:rPr>
+        <w:t xml:space="preserve">Id.</w:t>
+      </w:r>
+    </w:p>
+  </w:footnote>
+</w:footnotes>
+</file>
+
+<file path=word/ftr-add.xml><?xml version="1.0" encoding="utf-8"?>
+<w:ftr xmlns:w="http://schemas.openxmlformats.org/wordprocessingml/2006/main" xmlns:r="http://schemas.openxmlformats.org/officeDocument/2006/relationships">
+  <w:p>
+    <w:pPr>
+      <w:spacing w:before="0" w:after="0"/>
+      <w:jc w:val="center"/>
+    </w:pPr>
+    <w:r>
+      <w:t>Add-</w:t>
+    </w:r>
+    <w:r>
+      <w:fldChar w:fldCharType="begin"/>
+    </w:r>
+    <w:r>
+      <w:instrText xml:space="preserve"> PAGE </w:instrText>
+    </w:r>
+    <w:r>
+      <w:fldChar w:fldCharType="separate"/>
+    </w:r>
+    <w:r>
+      <w:t>1</w:t>
+    </w:r>
+    <w:r>
+      <w:fldChar w:fldCharType="end"/>
+    </w:r>
+  </w:p>
+</w:ftr>
+</file>
+
+<file path=word/ftr-none.xml><?xml version="1.0" encoding="utf-8"?>
+<w:ftr xmlns:w="http://schemas.openxmlformats.org/wordprocessingml/2006/main" xmlns:r="http://schemas.openxmlformats.org/officeDocument/2006/relationships">
+  <w:p>
+    <w:pPr>
+      <w:spacing w:before="0" w:after="0"/>
       <w:jc w:val="center"/>
     </w:pPr>
   </w:p>
 </w:ftr>
 </file>
 
-<file path=word/footer1.xml><?xml version="1.0" encoding="utf-8"?>
-<w:ftr xmlns:w="http://schemas.openxmlformats.org/wordprocessingml/2006/main">
+<file path=word/ftr-own1.xml><?xml version="1.0" encoding="utf-8"?>
+<w:ftr xmlns:w="http://schemas.openxmlformats.org/wordprocessingml/2006/main" xmlns:r="http://schemas.openxmlformats.org/officeDocument/2006/relationships">
   <w:p>
     <w:pPr>
       <w:spacing w:before="0" w:after="0" w:line="400" w:lineRule="exact"/>
@@ -2979,78 +3106,30 @@
 </w:ftr>
 </file>
 
-<file path=word/footnotes.xml><?xml version="1.0" encoding="utf-8"?>
-<w:footnotes xmlns:w="http://schemas.openxmlformats.org/wordprocessingml/2006/main" xmlns:m="http://schemas.openxmlformats.org/officeDocument/2006/math" xmlns:r="http://schemas.openxmlformats.org/officeDocument/2006/relationships" xmlns:o="urn:schemas-microsoft-com:office:office" xmlns:v="urn:schemas-microsoft-com:vml" xmlns:w10="urn:schemas-microsoft-com:office:word" xmlns:a="http://schemas.openxmlformats.org/drawingml/2006/main" xmlns:pic="http://schemas.openxmlformats.org/drawingml/2006/picture" xmlns:wp="http://schemas.openxmlformats.org/drawingml/2006/wordprocessingDrawing">
-  <w:footnote w:type="continuationSeparator" w:id="0">
-    <w:p>
-      <w:r>
-        <w:continuationSeparator/>
-      </w:r>
-    </w:p>
-  </w:footnote>
-  <w:footnote w:type="separator" w:id="-1">
-    <w:p>
-      <w:r>
-        <w:separator/>
-      </w:r>
-    </w:p>
-  </w:footnote>
-  <w:footnote w:id="9">
-    <w:p>
-      <w:pPr>
-        <w:pStyle w:val="FootnoteText"/>
-      </w:pPr>
-      <w:r>
-        <w:rPr>
-          <w:rStyle w:val="FootnoteReference"/>
-        </w:rPr>
-        <w:footnoteRef/>
-      </w:r>
-      <w:r>
-        <w:t xml:space="preserve"> </w:t>
-      </w:r>
-      <w:r>
-        <w:t xml:space="preserve">Like the district court in its opinion, PAM in its brief attempts to “carve the work environment into a series of discrete incidents and then measure the harm occurring in each episode,” which “is improper.”</w:t>
-      </w:r>
-      <w:r>
-        <w:t xml:space="preserve"> </w:t>
-      </w:r>
-      <w:r>
-        <w:rPr>
-          <w:i/>
-          <w:iCs/>
-        </w:rPr>
-        <w:t xml:space="preserve">McNeal v. City of Blue Ash</w:t>
-      </w:r>
-      <w:r>
-        <w:t xml:space="preserve">, 117 F.4th 887, 905 (6th Cir. 2024) (quoting</w:t>
-      </w:r>
-      <w:r>
-        <w:t xml:space="preserve"> </w:t>
-      </w:r>
-      <w:r>
-        <w:rPr>
-          <w:i/>
-          <w:iCs/>
-        </w:rPr>
-        <w:t xml:space="preserve">Jackson v. Quanex Corp.</w:t>
-      </w:r>
-      <w:r>
-        <w:t xml:space="preserve">, 191 F.3d 647, 660 (6th Cir. 1999)). Instead, “the ‘totality of the circumstances’ approach requires” courts “to examine [plaintiff]’s treatment cumulatively to see whether it created an atmosphere of hostility that was more than the sum of its parts.”</w:t>
-      </w:r>
-      <w:r>
-        <w:t xml:space="preserve"> </w:t>
-      </w:r>
-      <w:r>
-        <w:rPr>
-          <w:i/>
-          <w:iCs/>
-        </w:rPr>
-        <w:t xml:space="preserve">Id.</w:t>
-      </w:r>
-    </w:p>
-  </w:footnote>
-</w:footnotes>
+<file path=word/ftr-page.xml><?xml version="1.0" encoding="utf-8"?>
+<w:ftr xmlns:w="http://schemas.openxmlformats.org/wordprocessingml/2006/main" xmlns:r="http://schemas.openxmlformats.org/officeDocument/2006/relationships">
+  <w:p>
+    <w:pPr>
+      <w:spacing w:before="0" w:after="0"/>
+      <w:jc w:val="center"/>
+    </w:pPr>
+    <w:r>
+      <w:fldChar w:fldCharType="begin"/>
+    </w:r>
+    <w:r>
+      <w:instrText xml:space="preserve"> PAGE </w:instrText>
+    </w:r>
+    <w:r>
+      <w:fldChar w:fldCharType="separate"/>
+    </w:r>
+    <w:r>
+      <w:t>1</w:t>
+    </w:r>
+    <w:r>
+      <w:fldChar w:fldCharType="end"/>
+    </w:r>
+  </w:p>
+</w:ftr>
 </file>
 
 <file path=word/numbering.xml><?xml version="1.0" encoding="utf-8"?>

</xml_diff>